<commit_message>
Refresh all doc variants to Riyadh v12 metrics
</commit_message>
<xml_diff>
--- a/docs/defense_qa.docx
+++ b/docs/defense_qa.docx
@@ -141,7 +141,7 @@
         <w:pStyle w:val="ListBullet"/>
       </w:pPr>
       <w:r>
-        <w:t>A gap of ~14 R² points (0.93 → 0.79) is expected and honest. The holdout metric is the number to cite: R²=0.79, MedAPE=15.56%.</w:t>
+        <w:t>A gap of ~14 R² points (0.93 → 0.79) is expected and honest. The holdout metric is the number to cite: R²=0.79, MedAPE=15.59%.</w:t>
       </w:r>
     </w:p>
     <w:p/>
@@ -202,7 +202,7 @@
         <w:rPr>
           <w:b/>
         </w:rPr>
-        <w:t>Q: MedAPE of 15.56% seems high. Is that good enough?</w:t>
+        <w:t>Q: MedAPE of 15.59% seems high. Is that good enough?</w:t>
       </w:r>
     </w:p>
     <w:p>
@@ -213,7 +213,7 @@
         <w:t xml:space="preserve">SHORT: </w:t>
       </w:r>
       <w:r>
-        <w:t>Industry benchmark for AVM in emerging markets is 15–25%. 15.56% is within standard range for district aggregates without parcel-level data.</w:t>
+        <w:t>Industry benchmark for AVM in emerging markets is 15–25%. 15.59% is within standard range for district aggregates without parcel-level data.</w:t>
       </w:r>
     </w:p>
     <w:p>
@@ -245,7 +245,7 @@
         <w:pStyle w:val="ListBullet"/>
       </w:pPr>
       <w:r>
-        <w:t>By property type: apartment MedAPE=12.70%, villa=12.83%, plot=21.20%.</w:t>
+        <w:t>By property type: apartment MedAPE=12.83%, villa=12.39%, plot=20.82%.</w:t>
       </w:r>
     </w:p>
     <w:p/>
@@ -513,7 +513,7 @@
         <w:pStyle w:val="ListBullet"/>
       </w:pPr>
       <w:r>
-        <w:t>Empirical test: LightGBM meta holdout R²=0.6349 vs Ridge meta holdout R²=0.6495.</w:t>
+        <w:t>Empirical test: LightGBM meta holdout R²=0.6349 vs Ridge meta holdout R²=0.6450.</w:t>
       </w:r>
     </w:p>
     <w:p>
@@ -769,7 +769,7 @@
         <w:pStyle w:val="ListBullet"/>
       </w:pPr>
       <w:r>
-        <w:t>Standard 4 — Sample testing: 15% time-based holdout (NYC, n=27,763) and fully out-of-sample 2025 holdout (Riyadh, n=1,727); Spatial GroupKFold prevents geographic leakage.</w:t>
+        <w:t>Standard 4 — Sample testing: 15% time-based holdout (NYC, n=27,763) and fully out-of-sample 2025 holdout (Riyadh, n=1,730); Spatial GroupKFold prevents geographic leakage.</w:t>
       </w:r>
     </w:p>
     <w:p>
@@ -853,7 +853,7 @@
         <w:pStyle w:val="ListBullet"/>
       </w:pPr>
       <w:r>
-        <w:t>For 2026 predictions: acknowledge the policy-shift caveat. The 15.56% holdout MedAPE is expected to widen slightly until retrained on 2025–2026 data.</w:t>
+        <w:t>For 2026 predictions: acknowledge the policy-shift caveat. The 15.59% holdout MedAPE is expected to widen slightly until retrained on 2025–2026 data.</w:t>
       </w:r>
     </w:p>
     <w:p/>

</xml_diff>

<commit_message>
Document plots temporal-shift diagnosis in limitations, future work, and defense Q&A
</commit_message>
<xml_diff>
--- a/docs/defense_qa.docx
+++ b/docs/defense_qa.docx
@@ -904,6 +904,19 @@
         <w:t>→ 'Luxury transactions are sparse (&lt;3% of dataset) so the model is less confident there — correctly communicated via a wider range.'</w:t>
       </w:r>
     </w:p>
+    <w:p>
+      <w:r>
+        <w:rPr>
+          <w:b/>
+        </w:rPr>
+        <w:t>Riyadh residential plots are the weakest segment (MedAPE 20.8%).</w:t>
+      </w:r>
+    </w:p>
+    <w:p>
+      <w:r>
+        <w:t>→ 'We did the error analysis: it is systematic underprediction (median −15%) because plot prices surged in 2025 faster than lagged district features track — worst in illiquid districts. We empirically tested citywide per-type lag features; they did not fix it, so the documented path is a dedicated plots model or bias calibration.'</w:t>
+      </w:r>
+    </w:p>
     <w:sectPr>
       <w:pgSz w:w="12240" w:h="15840"/>
       <w:pgMar w:top="1417" w:right="1417" w:bottom="1417" w:left="1701" w:header="720" w:footer="720" w:gutter="0"/>

</xml_diff>